<commit_message>
Bascule par defaut sur llama3.2 (tool-calling calcul fiable) + filets de securite agent
</commit_message>
<xml_diff>
--- a/TP_Creer_Agent_IA.docx
+++ b/TP_Creer_Agent_IA.docx
@@ -1985,7 +1985,7 @@
         <w:ind w:left="360"/>
       </w:pPr>
       <w:r>
-        <w:t xml:space="preserve">Alternative de qualité : </w:t>
+        <w:t xml:space="preserve">Alternative plus éloquente : </w:t>
       </w:r>
       <w:r>
         <w:rPr>
@@ -1995,7 +1995,7 @@
         <w:t>qwen2.5:latest</w:t>
       </w:r>
       <w:r>
-        <w:t xml:space="preserve"> (mieux en code et plus fiable,</w:t>
+        <w:t xml:space="preserve"> (plus soigné en prose et</w:t>
       </w:r>
     </w:p>
     <w:p>
@@ -2004,7 +2004,7 @@
         <w:ind w:left="360"/>
       </w:pPr>
       <w:r>
-        <w:t>mais ~2-3x plus lent). Essayez-le sans toucher au code :</w:t>
+        <w:t>fichiers, MAIS saute les appels d'outil de calcul). Essayez sans toucher au</w:t>
       </w:r>
     </w:p>
     <w:p>
@@ -2012,6 +2012,9 @@
         <w:shd w:val="clear" w:color="auto" w:fill="E7F0FB"/>
         <w:ind w:left="360"/>
       </w:pPr>
+      <w:r>
+        <w:t xml:space="preserve">code : </w:t>
+      </w:r>
       <w:r>
         <w:rPr>
           <w:rFonts w:ascii="Consolas" w:hAnsi="Consolas"/>
@@ -14379,7 +14382,7 @@
               <w:t>ollama pull qwen2.5:latest</w:t>
             </w:r>
             <w:r>
-              <w:t xml:space="preserve"> pour plus de qualité)</w:t>
+              <w:t xml:space="preserve"> pour une prose plus soignée)</w:t>
             </w:r>
           </w:p>
         </w:tc>

</xml_diff>